<commit_message>
Installation guide: firmware update from the Arduino IDE, step by step with screenshots; sketch folder for the Arduino IDE in firmware/
</commit_message>
<xml_diff>
--- a/manuale/Instalare_RO.docx
+++ b/manuale/Instalare_RO.docx
@@ -5,6 +5,7 @@
     <w:p>
       <w:pPr>
         <w:pStyle w:val="Title"/>
+        <w:keepNext/>
       </w:pPr>
       <w:r>
         <w:t>Ghid de instalare — Field Box BT</w:t>
@@ -21,6 +22,7 @@
     <w:p>
       <w:pPr>
         <w:pStyle w:val="Heading2"/>
+        <w:keepNext/>
       </w:pPr>
       <w:r>
         <w:t>1. Ce vă trebuie</w:t>
@@ -99,6 +101,7 @@
     <w:p>
       <w:pPr>
         <w:pStyle w:val="Heading2"/>
+        <w:keepNext/>
       </w:pPr>
       <w:r>
         <w:t>2. Instalarea APK-ului pe telefon</w:t>
@@ -217,6 +220,7 @@
     </w:p>
     <w:p>
       <w:pPr>
+        <w:keepNext/>
         <w:spacing w:after="60"/>
         <w:ind w:left="510" w:hanging="340"/>
       </w:pPr>
@@ -259,6 +263,7 @@
     </w:p>
     <w:p>
       <w:pPr>
+        <w:keepNext/>
         <w:jc w:val="center"/>
       </w:pPr>
       <w:r>
@@ -385,6 +390,7 @@
     </w:p>
     <w:p>
       <w:pPr>
+        <w:keepNext/>
         <w:spacing w:after="60"/>
         <w:ind w:left="510" w:hanging="340"/>
       </w:pPr>
@@ -418,6 +424,7 @@
     </w:p>
     <w:p>
       <w:pPr>
+        <w:keepNext/>
         <w:jc w:val="center"/>
       </w:pPr>
       <w:r>
@@ -512,6 +519,7 @@
     <w:p>
       <w:pPr>
         <w:pStyle w:val="Heading2"/>
+        <w:keepNext/>
       </w:pPr>
       <w:r>
         <w:t>3. Prima pornire</w:t>
@@ -641,6 +649,7 @@
     </w:p>
     <w:p>
       <w:pPr>
+        <w:keepNext/>
         <w:spacing w:after="60"/>
         <w:ind w:left="510" w:hanging="340"/>
       </w:pPr>
@@ -680,6 +689,7 @@
     </w:p>
     <w:p>
       <w:pPr>
+        <w:keepNext/>
         <w:jc w:val="center"/>
       </w:pPr>
       <w:r>
@@ -732,6 +742,7 @@
     <w:p>
       <w:pPr>
         <w:pStyle w:val="Heading3"/>
+        <w:keepNext/>
       </w:pPr>
       <w:r>
         <w:t>Asocierea Bluetooth (o singură dată, per telefon și cutie)</w:t>
@@ -885,6 +896,7 @@
     </w:p>
     <w:p>
       <w:pPr>
+        <w:keepNext/>
         <w:spacing w:after="60"/>
         <w:ind w:left="510" w:hanging="340"/>
       </w:pPr>
@@ -927,6 +939,7 @@
     </w:p>
     <w:p>
       <w:pPr>
+        <w:keepNext/>
         <w:jc w:val="center"/>
       </w:pPr>
       <w:r>
@@ -979,6 +992,7 @@
     <w:p>
       <w:pPr>
         <w:pStyle w:val="Heading2"/>
+        <w:keepNext/>
       </w:pPr>
       <w:r>
         <w:t>4. Verificare rapidă</w:t>
@@ -1043,6 +1057,7 @@
     <w:p>
       <w:pPr>
         <w:pStyle w:val="Heading2"/>
+        <w:keepNext/>
       </w:pPr>
       <w:r>
         <w:t>5. Actualizarea cutiei (firmware) — pentru tehnician</w:t>
@@ -1050,7 +1065,63 @@
     </w:p>
     <w:p>
       <w:r>
-        <w:t>Acest pas nu se face de către profesori — este pentru persoana care are grijă de cutii.</w:t>
+        <w:t xml:space="preserve">Acest pas nu se face de către profesori — este pentru persoana care are grijă de cutii. Programul de pe cutie (firmware-ul) se scrie de pe un calculator cu Windows, prin cablul USB, cu </w:t>
+      </w:r>
+      <w:r>
+        <w:rPr>
+          <w:b/>
+        </w:rPr>
+        <w:t>Arduino IDE</w:t>
+      </w:r>
+      <w:r>
+        <w:t>. Fiecare pas de mai jos are o poză; chenarul roșu arată unde apăsați, iar săgeata mouse-ului stă pe elementul respectiv.</w:t>
+      </w:r>
+    </w:p>
+    <w:p>
+      <w:r>
+        <w:rPr>
+          <w:b/>
+        </w:rPr>
+        <w:t>Înainte de orice: luați datele de pe cutie.</w:t>
+      </w:r>
+      <w:r>
+        <w:t xml:space="preserve"> Prima pornire după o scriere de firmware reformatează stocarea cutiei. Din aplicație, tab-ul </w:t>
+      </w:r>
+      <w:r>
+        <w:rPr>
+          <w:b/>
+        </w:rPr>
+        <w:t>Files</w:t>
+      </w:r>
+      <w:r>
+        <w:t xml:space="preserve">: </w:t>
+      </w:r>
+      <w:r>
+        <w:rPr>
+          <w:b/>
+        </w:rPr>
+        <w:t>Download</w:t>
+      </w:r>
+      <w:r>
+        <w:t xml:space="preserve"> pe fiecare rând, sau </w:t>
+      </w:r>
+      <w:r>
+        <w:rPr>
+          <w:b/>
+        </w:rPr>
+        <w:t>PDF report</w:t>
+      </w:r>
+      <w:r>
+        <w:t xml:space="preserve"> (care descarcă singur jurnalul zilei). Orice a rămas pe cutie se pierde.</w:t>
+      </w:r>
+    </w:p>
+    <w:p>
+      <w:pPr>
+        <w:pStyle w:val="Heading3"/>
+        <w:keepNext/>
+      </w:pPr>
+      <w:r>
+        <w:t>5.1 Ce vă trebuie</w:t>
       </w:r>
     </w:p>
     <w:p>
@@ -1058,16 +1129,16 @@
         <w:pStyle w:val="ListBullet"/>
       </w:pPr>
       <w:r>
-        <w:t xml:space="preserve">Fișierul de firmware: </w:t>
+        <w:t xml:space="preserve">Un calculator cu </w:t>
       </w:r>
       <w:r>
         <w:rPr>
           <w:b/>
         </w:rPr>
-        <w:t>`fieldbox-fw-&lt;versiune&gt;.bin`</w:t>
-      </w:r>
-      <w:r>
-        <w:t>.</w:t>
+        <w:t>Windows 10/11</w:t>
+      </w:r>
+      <w:r>
+        <w:t xml:space="preserve"> și acces la internet (doar la pregătire).</w:t>
       </w:r>
     </w:p>
     <w:p>
@@ -1075,43 +1146,22 @@
         <w:pStyle w:val="ListBullet"/>
       </w:pPr>
       <w:r>
-        <w:t xml:space="preserve">Se scrie la adresa </w:t>
-      </w:r>
-      <w:r>
         <w:rPr>
           <w:b/>
         </w:rPr>
-        <w:t>`0x0`</w:t>
-      </w:r>
-      <w:r>
-        <w:t xml:space="preserve">, prin USB, cu </w:t>
+        <w:t>Arduino IDE 2</w:t>
+      </w:r>
+      <w:r>
+        <w:t xml:space="preserve">, descărcat gratuit de pe </w:t>
       </w:r>
       <w:r>
         <w:rPr>
           <w:b/>
         </w:rPr>
-        <w:t>esptool</w:t>
-      </w:r>
-      <w:r>
-        <w:t xml:space="preserve"> sau cu </w:t>
-      </w:r>
-      <w:r>
-        <w:rPr>
-          <w:b/>
-        </w:rPr>
-        <w:t>Flash Download Tool</w:t>
-      </w:r>
-      <w:r>
-        <w:t xml:space="preserve">; pe Windows e nevoie de driverul </w:t>
-      </w:r>
-      <w:r>
-        <w:rPr>
-          <w:b/>
-        </w:rPr>
-        <w:t>CH340</w:t>
-      </w:r>
-      <w:r>
-        <w:t xml:space="preserve"> pentru portul serial.</w:t>
+        <w:t>arduino.cc → Software</w:t>
+      </w:r>
+      <w:r>
+        <w:t xml:space="preserve"> și instalat cu opțiunile implicite.</w:t>
       </w:r>
     </w:p>
     <w:p>
@@ -1119,40 +1169,25 @@
         <w:pStyle w:val="ListBullet"/>
       </w:pPr>
       <w:r>
+        <w:t xml:space="preserve">Un </w:t>
+      </w:r>
+      <w:r>
         <w:rPr>
           <w:b/>
         </w:rPr>
-        <w:t>Prima pornire după o scriere de firmware reformatează stocarea cutiei.</w:t>
-      </w:r>
-      <w:r>
-        <w:t xml:space="preserve"> Luați mai întâi fișierele de pe cutie (tab-ul </w:t>
+        <w:t>cablu USB de date</w:t>
+      </w:r>
+      <w:r>
+        <w:t xml:space="preserve"> (nu doar de încărcare) pentru placa din cutie. Dacă Windows nu vede placa, instalați driverul </w:t>
       </w:r>
       <w:r>
         <w:rPr>
           <w:b/>
         </w:rPr>
-        <w:t>Files</w:t>
-      </w:r>
-      <w:r>
-        <w:t xml:space="preserve">: </w:t>
-      </w:r>
-      <w:r>
-        <w:rPr>
-          <w:b/>
-        </w:rPr>
-        <w:t>Download</w:t>
-      </w:r>
-      <w:r>
-        <w:t xml:space="preserve"> pe fiecare rând, sau </w:t>
-      </w:r>
-      <w:r>
-        <w:rPr>
-          <w:b/>
-        </w:rPr>
-        <w:t>PDF report</w:t>
-      </w:r>
-      <w:r>
-        <w:t>, care descarcă singur jurnalul zilei) — orice a rămas pe ea se pierde la actualizare.</w:t>
+        <w:t>CH340</w:t>
+      </w:r>
+      <w:r>
+        <w:t xml:space="preserve"> (căutați „CH340 driver” pe site-ul producătorului WCH).</w:t>
       </w:r>
     </w:p>
     <w:p>
@@ -1160,16 +1195,1668 @@
         <w:pStyle w:val="ListBullet"/>
       </w:pPr>
       <w:r>
-        <w:t>Numele cutiei (</w:t>
+        <w:t xml:space="preserve">Folderul </w:t>
       </w:r>
       <w:r>
         <w:rPr>
           <w:b/>
         </w:rPr>
-        <w:t>`BOX_xxxx`</w:t>
-      </w:r>
-      <w:r>
-        <w:t>) vine din adresa MAC Bluetooth a plăcii și nu se schimbă la o actualizare de firmware.</w:t>
+        <w:t>`firmware/fieldbox_bt_v0_3`</w:t>
+      </w:r>
+      <w:r>
+        <w:t xml:space="preserve"> din pachetul FieldBox (arhiva ZIP dezarhivată, de exemplu în </w:t>
+      </w:r>
+      <w:r>
+        <w:rPr>
+          <w:b/>
+        </w:rPr>
+        <w:t>Downloads</w:t>
+      </w:r>
+      <w:r>
+        <w:t xml:space="preserve">). Folderul conține două fișiere, </w:t>
+      </w:r>
+      <w:r>
+        <w:rPr>
+          <w:b/>
+        </w:rPr>
+        <w:t>`fieldbox_bt_v0_3.ino`</w:t>
+      </w:r>
+      <w:r>
+        <w:t xml:space="preserve"> și </w:t>
+      </w:r>
+      <w:r>
+        <w:rPr>
+          <w:b/>
+        </w:rPr>
+        <w:t>`partitions.csv`</w:t>
+      </w:r>
+      <w:r>
+        <w:t>, care trebuie să rămână împreună.</w:t>
+      </w:r>
+    </w:p>
+    <w:p>
+      <w:pPr>
+        <w:pStyle w:val="Heading3"/>
+        <w:keepNext/>
+      </w:pPr>
+      <w:r>
+        <w:t>5.2 Pregătirea Arduino IDE (o singură dată pe calculator)</w:t>
+      </w:r>
+    </w:p>
+    <w:p>
+      <w:pPr>
+        <w:keepNext/>
+        <w:spacing w:after="60"/>
+        <w:ind w:left="510" w:hanging="340"/>
+      </w:pPr>
+      <w:r>
+        <w:rPr>
+          <w:b w:val="0"/>
+        </w:rPr>
+        <w:t xml:space="preserve">1. </w:t>
+      </w:r>
+      <w:r>
+        <w:t xml:space="preserve">Deschideți Arduino IDE și apăsați meniul </w:t>
+      </w:r>
+      <w:r>
+        <w:rPr>
+          <w:b/>
+        </w:rPr>
+        <w:t>File</w:t>
+      </w:r>
+      <w:r>
+        <w:t>.</w:t>
+      </w:r>
+    </w:p>
+    <w:p>
+      <w:pPr>
+        <w:keepNext/>
+        <w:jc w:val="center"/>
+      </w:pPr>
+      <w:r>
+        <w:drawing>
+          <wp:inline xmlns:a="http://schemas.openxmlformats.org/drawingml/2006/main" xmlns:pic="http://schemas.openxmlformats.org/drawingml/2006/picture">
+            <wp:extent cx="4896000" cy="3060000"/>
+            <wp:docPr id="5" name="Picture 5"/>
+            <wp:cNvGraphicFramePr>
+              <a:graphicFrameLocks noChangeAspect="1"/>
+            </wp:cNvGraphicFramePr>
+            <a:graphic>
+              <a:graphicData uri="http://schemas.openxmlformats.org/drawingml/2006/picture">
+                <pic:pic>
+                  <pic:nvPicPr>
+                    <pic:cNvPr id="0" name="fw_01.png"/>
+                    <pic:cNvPicPr/>
+                  </pic:nvPicPr>
+                  <pic:blipFill>
+                    <a:blip r:embed="rId13"/>
+                    <a:stretch>
+                      <a:fillRect/>
+                    </a:stretch>
+                  </pic:blipFill>
+                  <pic:spPr>
+                    <a:xfrm>
+                      <a:off x="0" y="0"/>
+                      <a:ext cx="4896000" cy="3060000"/>
+                    </a:xfrm>
+                    <a:prstGeom prst="rect"/>
+                  </pic:spPr>
+                </pic:pic>
+              </a:graphicData>
+            </a:graphic>
+          </wp:inline>
+        </w:drawing>
+      </w:r>
+    </w:p>
+    <w:p>
+      <w:pPr>
+        <w:jc w:val="center"/>
+      </w:pPr>
+      <w:r>
+        <w:rPr>
+          <w:i/>
+          <w:sz w:val="18"/>
+        </w:rPr>
+        <w:t>Meniul File</w:t>
+      </w:r>
+    </w:p>
+    <w:p>
+      <w:pPr>
+        <w:keepNext/>
+        <w:spacing w:after="60"/>
+        <w:ind w:left="510" w:hanging="340"/>
+      </w:pPr>
+      <w:r>
+        <w:rPr>
+          <w:b w:val="0"/>
+        </w:rPr>
+        <w:t xml:space="preserve">2. </w:t>
+      </w:r>
+      <w:r>
+        <w:t xml:space="preserve">Alegeți </w:t>
+      </w:r>
+      <w:r>
+        <w:rPr>
+          <w:b/>
+        </w:rPr>
+        <w:t>Preferences…</w:t>
+      </w:r>
+      <w:r>
+        <w:t>.</w:t>
+      </w:r>
+    </w:p>
+    <w:p>
+      <w:pPr>
+        <w:keepNext/>
+        <w:jc w:val="center"/>
+      </w:pPr>
+      <w:r>
+        <w:drawing>
+          <wp:inline xmlns:a="http://schemas.openxmlformats.org/drawingml/2006/main" xmlns:pic="http://schemas.openxmlformats.org/drawingml/2006/picture">
+            <wp:extent cx="4896000" cy="3060000"/>
+            <wp:docPr id="6" name="Picture 6"/>
+            <wp:cNvGraphicFramePr>
+              <a:graphicFrameLocks noChangeAspect="1"/>
+            </wp:cNvGraphicFramePr>
+            <a:graphic>
+              <a:graphicData uri="http://schemas.openxmlformats.org/drawingml/2006/picture">
+                <pic:pic>
+                  <pic:nvPicPr>
+                    <pic:cNvPr id="0" name="fw_02.png"/>
+                    <pic:cNvPicPr/>
+                  </pic:nvPicPr>
+                  <pic:blipFill>
+                    <a:blip r:embed="rId14"/>
+                    <a:stretch>
+                      <a:fillRect/>
+                    </a:stretch>
+                  </pic:blipFill>
+                  <pic:spPr>
+                    <a:xfrm>
+                      <a:off x="0" y="0"/>
+                      <a:ext cx="4896000" cy="3060000"/>
+                    </a:xfrm>
+                    <a:prstGeom prst="rect"/>
+                  </pic:spPr>
+                </pic:pic>
+              </a:graphicData>
+            </a:graphic>
+          </wp:inline>
+        </w:drawing>
+      </w:r>
+    </w:p>
+    <w:p>
+      <w:pPr>
+        <w:jc w:val="center"/>
+      </w:pPr>
+      <w:r>
+        <w:rPr>
+          <w:i/>
+          <w:sz w:val="18"/>
+        </w:rPr>
+        <w:t>File → Preferences</w:t>
+      </w:r>
+    </w:p>
+    <w:p>
+      <w:pPr>
+        <w:keepNext/>
+        <w:spacing w:after="60"/>
+        <w:ind w:left="510" w:hanging="340"/>
+      </w:pPr>
+      <w:r>
+        <w:rPr>
+          <w:b w:val="0"/>
+        </w:rPr>
+        <w:t xml:space="preserve">3. </w:t>
+      </w:r>
+      <w:r>
+        <w:t xml:space="preserve">În câmpul </w:t>
+      </w:r>
+      <w:r>
+        <w:rPr>
+          <w:b/>
+        </w:rPr>
+        <w:t>Additional boards manager URLs</w:t>
+      </w:r>
+      <w:r>
+        <w:t xml:space="preserve"> lipiți adresa de mai jos, apoi apăsați </w:t>
+      </w:r>
+      <w:r>
+        <w:rPr>
+          <w:b/>
+        </w:rPr>
+        <w:t>OK</w:t>
+      </w:r>
+      <w:r>
+        <w:t xml:space="preserve">: </w:t>
+      </w:r>
+      <w:r>
+        <w:rPr>
+          <w:rFonts w:ascii="Consolas" w:hAnsi="Consolas"/>
+          <w:sz w:val="19"/>
+        </w:rPr>
+        <w:t>https://raw.githubusercontent.com/espressif/arduino-esp32/gh-pages/package_esp32_index.json</w:t>
+      </w:r>
+    </w:p>
+    <w:p>
+      <w:pPr>
+        <w:keepNext/>
+        <w:jc w:val="center"/>
+      </w:pPr>
+      <w:r>
+        <w:drawing>
+          <wp:inline xmlns:a="http://schemas.openxmlformats.org/drawingml/2006/main" xmlns:pic="http://schemas.openxmlformats.org/drawingml/2006/picture">
+            <wp:extent cx="4587118" cy="3060000"/>
+            <wp:docPr id="7" name="Picture 7"/>
+            <wp:cNvGraphicFramePr>
+              <a:graphicFrameLocks noChangeAspect="1"/>
+            </wp:cNvGraphicFramePr>
+            <a:graphic>
+              <a:graphicData uri="http://schemas.openxmlformats.org/drawingml/2006/picture">
+                <pic:pic>
+                  <pic:nvPicPr>
+                    <pic:cNvPr id="0" name="fw_03.png"/>
+                    <pic:cNvPicPr/>
+                  </pic:nvPicPr>
+                  <pic:blipFill>
+                    <a:blip r:embed="rId15"/>
+                    <a:stretch>
+                      <a:fillRect/>
+                    </a:stretch>
+                  </pic:blipFill>
+                  <pic:spPr>
+                    <a:xfrm>
+                      <a:off x="0" y="0"/>
+                      <a:ext cx="4587118" cy="3060000"/>
+                    </a:xfrm>
+                    <a:prstGeom prst="rect"/>
+                  </pic:spPr>
+                </pic:pic>
+              </a:graphicData>
+            </a:graphic>
+          </wp:inline>
+        </w:drawing>
+      </w:r>
+    </w:p>
+    <w:p>
+      <w:pPr>
+        <w:jc w:val="center"/>
+      </w:pPr>
+      <w:r>
+        <w:rPr>
+          <w:i/>
+          <w:sz w:val="18"/>
+        </w:rPr>
+        <w:t>Adresa plăcilor ESP32 în Preferences</w:t>
+      </w:r>
+    </w:p>
+    <w:p>
+      <w:pPr>
+        <w:keepNext/>
+        <w:spacing w:after="60"/>
+        <w:ind w:left="510" w:hanging="340"/>
+      </w:pPr>
+      <w:r>
+        <w:rPr>
+          <w:b w:val="0"/>
+        </w:rPr>
+        <w:t xml:space="preserve">4. </w:t>
+      </w:r>
+      <w:r>
+        <w:t>Apăsați a doua pictogramă din bara din stânga (</w:t>
+      </w:r>
+      <w:r>
+        <w:rPr>
+          <w:b/>
+        </w:rPr>
+        <w:t>Boards Manager</w:t>
+      </w:r>
+      <w:r>
+        <w:t xml:space="preserve">), scrieți </w:t>
+      </w:r>
+      <w:r>
+        <w:rPr>
+          <w:b/>
+        </w:rPr>
+        <w:t>esp32</w:t>
+      </w:r>
+      <w:r>
+        <w:t xml:space="preserve"> în căutare și, la </w:t>
+      </w:r>
+      <w:r>
+        <w:rPr>
+          <w:b/>
+        </w:rPr>
+        <w:t>esp32 by Espressif Systems</w:t>
+      </w:r>
+      <w:r>
+        <w:t xml:space="preserve">, apăsați </w:t>
+      </w:r>
+      <w:r>
+        <w:rPr>
+          <w:b/>
+        </w:rPr>
+        <w:t>INSTALL</w:t>
+      </w:r>
+      <w:r>
+        <w:t>. Nu îl alegeți pe cel de deasupra, „Arduino ESP32 Boards”. Instalarea durează câteva minute. Dacă e deja instalat, scrie „installed” sub nume și nu mai e nimic de făcut.</w:t>
+      </w:r>
+    </w:p>
+    <w:p>
+      <w:pPr>
+        <w:keepNext/>
+        <w:jc w:val="center"/>
+      </w:pPr>
+      <w:r>
+        <w:drawing>
+          <wp:inline xmlns:a="http://schemas.openxmlformats.org/drawingml/2006/main" xmlns:pic="http://schemas.openxmlformats.org/drawingml/2006/picture">
+            <wp:extent cx="3934285" cy="3059999"/>
+            <wp:docPr id="8" name="Picture 8"/>
+            <wp:cNvGraphicFramePr>
+              <a:graphicFrameLocks noChangeAspect="1"/>
+            </wp:cNvGraphicFramePr>
+            <a:graphic>
+              <a:graphicData uri="http://schemas.openxmlformats.org/drawingml/2006/picture">
+                <pic:pic>
+                  <pic:nvPicPr>
+                    <pic:cNvPr id="0" name="fw_04.png"/>
+                    <pic:cNvPicPr/>
+                  </pic:nvPicPr>
+                  <pic:blipFill>
+                    <a:blip r:embed="rId16"/>
+                    <a:stretch>
+                      <a:fillRect/>
+                    </a:stretch>
+                  </pic:blipFill>
+                  <pic:spPr>
+                    <a:xfrm>
+                      <a:off x="0" y="0"/>
+                      <a:ext cx="3934285" cy="3059999"/>
+                    </a:xfrm>
+                    <a:prstGeom prst="rect"/>
+                  </pic:spPr>
+                </pic:pic>
+              </a:graphicData>
+            </a:graphic>
+          </wp:inline>
+        </w:drawing>
+      </w:r>
+    </w:p>
+    <w:p>
+      <w:pPr>
+        <w:jc w:val="center"/>
+      </w:pPr>
+      <w:r>
+        <w:rPr>
+          <w:i/>
+          <w:sz w:val="18"/>
+        </w:rPr>
+        <w:t>Boards Manager: esp32 by Espressif Systems</w:t>
+      </w:r>
+    </w:p>
+    <w:p>
+      <w:pPr>
+        <w:spacing w:after="60"/>
+        <w:ind w:left="510" w:hanging="340"/>
+      </w:pPr>
+      <w:r>
+        <w:rPr>
+          <w:b w:val="0"/>
+        </w:rPr>
+        <w:t xml:space="preserve">5. </w:t>
+      </w:r>
+      <w:r>
+        <w:t>Apăsați a treia pictogramă (</w:t>
+      </w:r>
+      <w:r>
+        <w:rPr>
+          <w:b/>
+        </w:rPr>
+        <w:t>Library Manager</w:t>
+      </w:r>
+      <w:r>
+        <w:t xml:space="preserve">) și instalați, pe rând, bibliotecile de mai jos. Scrieți numele în căutare și apăsați </w:t>
+      </w:r>
+      <w:r>
+        <w:rPr>
+          <w:b/>
+        </w:rPr>
+        <w:t>INSTALL</w:t>
+      </w:r>
+      <w:r>
+        <w:t xml:space="preserve">. Dacă apare întrebarea despre dependențe, apăsați </w:t>
+      </w:r>
+      <w:r>
+        <w:rPr>
+          <w:b/>
+        </w:rPr>
+        <w:t>INSTALL ALL</w:t>
+      </w:r>
+      <w:r>
+        <w:t>.</w:t>
+      </w:r>
+    </w:p>
+    <w:p>
+      <w:pPr>
+        <w:pStyle w:val="ListBullet2"/>
+      </w:pPr>
+      <w:r>
+        <w:rPr>
+          <w:b/>
+        </w:rPr>
+        <w:t>Adafruit BME280 Library</w:t>
+      </w:r>
+    </w:p>
+    <w:p>
+      <w:pPr>
+        <w:pStyle w:val="ListBullet2"/>
+      </w:pPr>
+      <w:r>
+        <w:rPr>
+          <w:b/>
+        </w:rPr>
+        <w:t>Adafruit VEML7700 Library</w:t>
+      </w:r>
+    </w:p>
+    <w:p>
+      <w:pPr>
+        <w:pStyle w:val="ListBullet2"/>
+      </w:pPr>
+      <w:r>
+        <w:rPr>
+          <w:b/>
+        </w:rPr>
+        <w:t>Adafruit Unified Sensor</w:t>
+      </w:r>
+      <w:r>
+        <w:t xml:space="preserve"> (de obicei se instalează singură împreună cu prima)</w:t>
+      </w:r>
+    </w:p>
+    <w:p>
+      <w:pPr>
+        <w:pStyle w:val="ListBullet2"/>
+        <w:keepNext/>
+      </w:pPr>
+      <w:r>
+        <w:rPr>
+          <w:b/>
+        </w:rPr>
+        <w:t>SparkFun SCD4x Arduino Library</w:t>
+      </w:r>
+    </w:p>
+    <w:p>
+      <w:pPr>
+        <w:keepNext/>
+        <w:jc w:val="center"/>
+      </w:pPr>
+      <w:r>
+        <w:drawing>
+          <wp:inline xmlns:a="http://schemas.openxmlformats.org/drawingml/2006/main" xmlns:pic="http://schemas.openxmlformats.org/drawingml/2006/picture">
+            <wp:extent cx="4896000" cy="3060000"/>
+            <wp:docPr id="9" name="Picture 9"/>
+            <wp:cNvGraphicFramePr>
+              <a:graphicFrameLocks noChangeAspect="1"/>
+            </wp:cNvGraphicFramePr>
+            <a:graphic>
+              <a:graphicData uri="http://schemas.openxmlformats.org/drawingml/2006/picture">
+                <pic:pic>
+                  <pic:nvPicPr>
+                    <pic:cNvPr id="0" name="fw_05.png"/>
+                    <pic:cNvPicPr/>
+                  </pic:nvPicPr>
+                  <pic:blipFill>
+                    <a:blip r:embed="rId17"/>
+                    <a:stretch>
+                      <a:fillRect/>
+                    </a:stretch>
+                  </pic:blipFill>
+                  <pic:spPr>
+                    <a:xfrm>
+                      <a:off x="0" y="0"/>
+                      <a:ext cx="4896000" cy="3060000"/>
+                    </a:xfrm>
+                    <a:prstGeom prst="rect"/>
+                  </pic:spPr>
+                </pic:pic>
+              </a:graphicData>
+            </a:graphic>
+          </wp:inline>
+        </w:drawing>
+      </w:r>
+    </w:p>
+    <w:p>
+      <w:pPr>
+        <w:keepNext/>
+        <w:jc w:val="center"/>
+      </w:pPr>
+      <w:r>
+        <w:rPr>
+          <w:i/>
+          <w:sz w:val="18"/>
+        </w:rPr>
+        <w:t>Library Manager: Adafruit BME280</w:t>
+      </w:r>
+    </w:p>
+    <w:p>
+      <w:pPr>
+        <w:keepNext/>
+        <w:jc w:val="center"/>
+      </w:pPr>
+      <w:r>
+        <w:drawing>
+          <wp:inline xmlns:a="http://schemas.openxmlformats.org/drawingml/2006/main" xmlns:pic="http://schemas.openxmlformats.org/drawingml/2006/picture">
+            <wp:extent cx="4896000" cy="3060000"/>
+            <wp:docPr id="10" name="Picture 10"/>
+            <wp:cNvGraphicFramePr>
+              <a:graphicFrameLocks noChangeAspect="1"/>
+            </wp:cNvGraphicFramePr>
+            <a:graphic>
+              <a:graphicData uri="http://schemas.openxmlformats.org/drawingml/2006/picture">
+                <pic:pic>
+                  <pic:nvPicPr>
+                    <pic:cNvPr id="0" name="fw_06.png"/>
+                    <pic:cNvPicPr/>
+                  </pic:nvPicPr>
+                  <pic:blipFill>
+                    <a:blip r:embed="rId18"/>
+                    <a:stretch>
+                      <a:fillRect/>
+                    </a:stretch>
+                  </pic:blipFill>
+                  <pic:spPr>
+                    <a:xfrm>
+                      <a:off x="0" y="0"/>
+                      <a:ext cx="4896000" cy="3060000"/>
+                    </a:xfrm>
+                    <a:prstGeom prst="rect"/>
+                  </pic:spPr>
+                </pic:pic>
+              </a:graphicData>
+            </a:graphic>
+          </wp:inline>
+        </w:drawing>
+      </w:r>
+    </w:p>
+    <w:p>
+      <w:pPr>
+        <w:jc w:val="center"/>
+      </w:pPr>
+      <w:r>
+        <w:rPr>
+          <w:i/>
+          <w:sz w:val="18"/>
+        </w:rPr>
+        <w:t>Library Manager: SparkFun SCD4x</w:t>
+      </w:r>
+    </w:p>
+    <w:p>
+      <w:pPr>
+        <w:pStyle w:val="Heading3"/>
+        <w:keepNext/>
+      </w:pPr>
+      <w:r>
+        <w:t>5.3 Scrierea firmware-ului pe cutie</w:t>
+      </w:r>
+    </w:p>
+    <w:p>
+      <w:pPr>
+        <w:spacing w:after="60"/>
+        <w:ind w:left="510" w:hanging="340"/>
+      </w:pPr>
+      <w:r>
+        <w:rPr>
+          <w:b w:val="0"/>
+        </w:rPr>
+        <w:t xml:space="preserve">1. </w:t>
+      </w:r>
+      <w:r>
+        <w:t>Conectați placa din cutie la calculator cu cablul USB.</w:t>
+      </w:r>
+    </w:p>
+    <w:p>
+      <w:pPr>
+        <w:keepNext/>
+        <w:spacing w:after="60"/>
+        <w:ind w:left="510" w:hanging="340"/>
+      </w:pPr>
+      <w:r>
+        <w:rPr>
+          <w:b w:val="0"/>
+        </w:rPr>
+        <w:t xml:space="preserve">2. </w:t>
+      </w:r>
+      <w:r>
+        <w:t xml:space="preserve">În Arduino IDE: </w:t>
+      </w:r>
+      <w:r>
+        <w:rPr>
+          <w:b/>
+        </w:rPr>
+        <w:t>File → Open…</w:t>
+      </w:r>
+      <w:r>
+        <w:t>.</w:t>
+      </w:r>
+    </w:p>
+    <w:p>
+      <w:pPr>
+        <w:keepNext/>
+        <w:jc w:val="center"/>
+      </w:pPr>
+      <w:r>
+        <w:drawing>
+          <wp:inline xmlns:a="http://schemas.openxmlformats.org/drawingml/2006/main" xmlns:pic="http://schemas.openxmlformats.org/drawingml/2006/picture">
+            <wp:extent cx="4896000" cy="3060000"/>
+            <wp:docPr id="11" name="Picture 11"/>
+            <wp:cNvGraphicFramePr>
+              <a:graphicFrameLocks noChangeAspect="1"/>
+            </wp:cNvGraphicFramePr>
+            <a:graphic>
+              <a:graphicData uri="http://schemas.openxmlformats.org/drawingml/2006/picture">
+                <pic:pic>
+                  <pic:nvPicPr>
+                    <pic:cNvPr id="0" name="fw_07.png"/>
+                    <pic:cNvPicPr/>
+                  </pic:nvPicPr>
+                  <pic:blipFill>
+                    <a:blip r:embed="rId19"/>
+                    <a:stretch>
+                      <a:fillRect/>
+                    </a:stretch>
+                  </pic:blipFill>
+                  <pic:spPr>
+                    <a:xfrm>
+                      <a:off x="0" y="0"/>
+                      <a:ext cx="4896000" cy="3060000"/>
+                    </a:xfrm>
+                    <a:prstGeom prst="rect"/>
+                  </pic:spPr>
+                </pic:pic>
+              </a:graphicData>
+            </a:graphic>
+          </wp:inline>
+        </w:drawing>
+      </w:r>
+    </w:p>
+    <w:p>
+      <w:pPr>
+        <w:jc w:val="center"/>
+      </w:pPr>
+      <w:r>
+        <w:rPr>
+          <w:i/>
+          <w:sz w:val="18"/>
+        </w:rPr>
+        <w:t>File → Open</w:t>
+      </w:r>
+    </w:p>
+    <w:p>
+      <w:pPr>
+        <w:keepNext/>
+        <w:spacing w:after="60"/>
+        <w:ind w:left="510" w:hanging="340"/>
+      </w:pPr>
+      <w:r>
+        <w:rPr>
+          <w:b w:val="0"/>
+        </w:rPr>
+        <w:t xml:space="preserve">3. </w:t>
+      </w:r>
+      <w:r>
+        <w:t xml:space="preserve">În fereastra </w:t>
+      </w:r>
+      <w:r>
+        <w:rPr>
+          <w:b/>
+        </w:rPr>
+        <w:t>Open</w:t>
+      </w:r>
+      <w:r>
+        <w:t xml:space="preserve">, alegeți </w:t>
+      </w:r>
+      <w:r>
+        <w:rPr>
+          <w:b/>
+        </w:rPr>
+        <w:t>Downloads</w:t>
+      </w:r>
+      <w:r>
+        <w:t xml:space="preserve"> în stânga, apoi dublu-clic pe folderul </w:t>
+      </w:r>
+      <w:r>
+        <w:rPr>
+          <w:b/>
+        </w:rPr>
+        <w:t>FieldBox_v…</w:t>
+      </w:r>
+      <w:r>
+        <w:t>.</w:t>
+      </w:r>
+    </w:p>
+    <w:p>
+      <w:pPr>
+        <w:keepNext/>
+        <w:jc w:val="center"/>
+      </w:pPr>
+      <w:r>
+        <w:drawing>
+          <wp:inline xmlns:a="http://schemas.openxmlformats.org/drawingml/2006/main" xmlns:pic="http://schemas.openxmlformats.org/drawingml/2006/picture">
+            <wp:extent cx="6120000" cy="1901025"/>
+            <wp:docPr id="12" name="Picture 12"/>
+            <wp:cNvGraphicFramePr>
+              <a:graphicFrameLocks noChangeAspect="1"/>
+            </wp:cNvGraphicFramePr>
+            <a:graphic>
+              <a:graphicData uri="http://schemas.openxmlformats.org/drawingml/2006/picture">
+                <pic:pic>
+                  <pic:nvPicPr>
+                    <pic:cNvPr id="0" name="fw_08.png"/>
+                    <pic:cNvPicPr/>
+                  </pic:nvPicPr>
+                  <pic:blipFill>
+                    <a:blip r:embed="rId20"/>
+                    <a:stretch>
+                      <a:fillRect/>
+                    </a:stretch>
+                  </pic:blipFill>
+                  <pic:spPr>
+                    <a:xfrm>
+                      <a:off x="0" y="0"/>
+                      <a:ext cx="6120000" cy="1901025"/>
+                    </a:xfrm>
+                    <a:prstGeom prst="rect"/>
+                  </pic:spPr>
+                </pic:pic>
+              </a:graphicData>
+            </a:graphic>
+          </wp:inline>
+        </w:drawing>
+      </w:r>
+    </w:p>
+    <w:p>
+      <w:pPr>
+        <w:jc w:val="center"/>
+      </w:pPr>
+      <w:r>
+        <w:rPr>
+          <w:i/>
+          <w:sz w:val="18"/>
+        </w:rPr>
+        <w:t>Downloads → FieldBox</w:t>
+      </w:r>
+    </w:p>
+    <w:p>
+      <w:pPr>
+        <w:keepNext/>
+        <w:spacing w:after="60"/>
+        <w:ind w:left="510" w:hanging="340"/>
+      </w:pPr>
+      <w:r>
+        <w:rPr>
+          <w:b w:val="0"/>
+        </w:rPr>
+        <w:t xml:space="preserve">4. </w:t>
+      </w:r>
+      <w:r>
+        <w:t xml:space="preserve">Dublu-clic pe </w:t>
+      </w:r>
+      <w:r>
+        <w:rPr>
+          <w:b/>
+        </w:rPr>
+        <w:t>firmware</w:t>
+      </w:r>
+      <w:r>
+        <w:t>…</w:t>
+      </w:r>
+    </w:p>
+    <w:p>
+      <w:pPr>
+        <w:keepNext/>
+        <w:jc w:val="center"/>
+      </w:pPr>
+      <w:r>
+        <w:drawing>
+          <wp:inline xmlns:a="http://schemas.openxmlformats.org/drawingml/2006/main" xmlns:pic="http://schemas.openxmlformats.org/drawingml/2006/picture">
+            <wp:extent cx="6120000" cy="1770975"/>
+            <wp:docPr id="13" name="Picture 13"/>
+            <wp:cNvGraphicFramePr>
+              <a:graphicFrameLocks noChangeAspect="1"/>
+            </wp:cNvGraphicFramePr>
+            <a:graphic>
+              <a:graphicData uri="http://schemas.openxmlformats.org/drawingml/2006/picture">
+                <pic:pic>
+                  <pic:nvPicPr>
+                    <pic:cNvPr id="0" name="fw_09.png"/>
+                    <pic:cNvPicPr/>
+                  </pic:nvPicPr>
+                  <pic:blipFill>
+                    <a:blip r:embed="rId21"/>
+                    <a:stretch>
+                      <a:fillRect/>
+                    </a:stretch>
+                  </pic:blipFill>
+                  <pic:spPr>
+                    <a:xfrm>
+                      <a:off x="0" y="0"/>
+                      <a:ext cx="6120000" cy="1770975"/>
+                    </a:xfrm>
+                    <a:prstGeom prst="rect"/>
+                  </pic:spPr>
+                </pic:pic>
+              </a:graphicData>
+            </a:graphic>
+          </wp:inline>
+        </w:drawing>
+      </w:r>
+    </w:p>
+    <w:p>
+      <w:pPr>
+        <w:jc w:val="center"/>
+      </w:pPr>
+      <w:r>
+        <w:rPr>
+          <w:i/>
+          <w:sz w:val="18"/>
+        </w:rPr>
+        <w:t>Folderul firmware</w:t>
+      </w:r>
+    </w:p>
+    <w:p>
+      <w:pPr>
+        <w:keepNext/>
+        <w:spacing w:after="60"/>
+        <w:ind w:left="510" w:hanging="340"/>
+      </w:pPr>
+      <w:r>
+        <w:rPr>
+          <w:b w:val="0"/>
+        </w:rPr>
+        <w:t xml:space="preserve">5. </w:t>
+      </w:r>
+      <w:r>
+        <w:t xml:space="preserve">…apoi pe </w:t>
+      </w:r>
+      <w:r>
+        <w:rPr>
+          <w:b/>
+        </w:rPr>
+        <w:t>fieldbox_bt_v0_3</w:t>
+      </w:r>
+      <w:r>
+        <w:t>.</w:t>
+      </w:r>
+    </w:p>
+    <w:p>
+      <w:pPr>
+        <w:keepNext/>
+        <w:jc w:val="center"/>
+      </w:pPr>
+      <w:r>
+        <w:drawing>
+          <wp:inline xmlns:a="http://schemas.openxmlformats.org/drawingml/2006/main" xmlns:pic="http://schemas.openxmlformats.org/drawingml/2006/picture">
+            <wp:extent cx="6120000" cy="1770975"/>
+            <wp:docPr id="14" name="Picture 14"/>
+            <wp:cNvGraphicFramePr>
+              <a:graphicFrameLocks noChangeAspect="1"/>
+            </wp:cNvGraphicFramePr>
+            <a:graphic>
+              <a:graphicData uri="http://schemas.openxmlformats.org/drawingml/2006/picture">
+                <pic:pic>
+                  <pic:nvPicPr>
+                    <pic:cNvPr id="0" name="fw_10.png"/>
+                    <pic:cNvPicPr/>
+                  </pic:nvPicPr>
+                  <pic:blipFill>
+                    <a:blip r:embed="rId22"/>
+                    <a:stretch>
+                      <a:fillRect/>
+                    </a:stretch>
+                  </pic:blipFill>
+                  <pic:spPr>
+                    <a:xfrm>
+                      <a:off x="0" y="0"/>
+                      <a:ext cx="6120000" cy="1770975"/>
+                    </a:xfrm>
+                    <a:prstGeom prst="rect"/>
+                  </pic:spPr>
+                </pic:pic>
+              </a:graphicData>
+            </a:graphic>
+          </wp:inline>
+        </w:drawing>
+      </w:r>
+    </w:p>
+    <w:p>
+      <w:pPr>
+        <w:jc w:val="center"/>
+      </w:pPr>
+      <w:r>
+        <w:rPr>
+          <w:i/>
+          <w:sz w:val="18"/>
+        </w:rPr>
+        <w:t>Folderul fieldbox_bt_v0_3</w:t>
+      </w:r>
+    </w:p>
+    <w:p>
+      <w:pPr>
+        <w:keepNext/>
+        <w:spacing w:after="60"/>
+        <w:ind w:left="510" w:hanging="340"/>
+      </w:pPr>
+      <w:r>
+        <w:rPr>
+          <w:b w:val="0"/>
+        </w:rPr>
+        <w:t xml:space="preserve">6. </w:t>
+      </w:r>
+      <w:r>
+        <w:t xml:space="preserve">Selectați </w:t>
+      </w:r>
+      <w:r>
+        <w:rPr>
+          <w:b/>
+        </w:rPr>
+        <w:t>fieldbox_bt_v0_3.ino</w:t>
+      </w:r>
+      <w:r>
+        <w:t xml:space="preserve"> și apăsați </w:t>
+      </w:r>
+      <w:r>
+        <w:rPr>
+          <w:b/>
+        </w:rPr>
+        <w:t>Open</w:t>
+      </w:r>
+      <w:r>
+        <w:t xml:space="preserve">. Programul se deschide într-o fereastră nouă. Lucrați mai departe în aceasta, cu titlul </w:t>
+      </w:r>
+      <w:r>
+        <w:rPr>
+          <w:b/>
+        </w:rPr>
+        <w:t>fieldbox_bt_v0_3</w:t>
+      </w:r>
+      <w:r>
+        <w:t>.</w:t>
+      </w:r>
+    </w:p>
+    <w:p>
+      <w:pPr>
+        <w:keepNext/>
+        <w:jc w:val="center"/>
+      </w:pPr>
+      <w:r>
+        <w:drawing>
+          <wp:inline xmlns:a="http://schemas.openxmlformats.org/drawingml/2006/main" xmlns:pic="http://schemas.openxmlformats.org/drawingml/2006/picture">
+            <wp:extent cx="3996734" cy="3059999"/>
+            <wp:docPr id="15" name="Picture 15"/>
+            <wp:cNvGraphicFramePr>
+              <a:graphicFrameLocks noChangeAspect="1"/>
+            </wp:cNvGraphicFramePr>
+            <a:graphic>
+              <a:graphicData uri="http://schemas.openxmlformats.org/drawingml/2006/picture">
+                <pic:pic>
+                  <pic:nvPicPr>
+                    <pic:cNvPr id="0" name="fw_11.png"/>
+                    <pic:cNvPicPr/>
+                  </pic:nvPicPr>
+                  <pic:blipFill>
+                    <a:blip r:embed="rId23"/>
+                    <a:stretch>
+                      <a:fillRect/>
+                    </a:stretch>
+                  </pic:blipFill>
+                  <pic:spPr>
+                    <a:xfrm>
+                      <a:off x="0" y="0"/>
+                      <a:ext cx="3996734" cy="3059999"/>
+                    </a:xfrm>
+                    <a:prstGeom prst="rect"/>
+                  </pic:spPr>
+                </pic:pic>
+              </a:graphicData>
+            </a:graphic>
+          </wp:inline>
+        </w:drawing>
+      </w:r>
+    </w:p>
+    <w:p>
+      <w:pPr>
+        <w:jc w:val="center"/>
+      </w:pPr>
+      <w:r>
+        <w:rPr>
+          <w:i/>
+          <w:sz w:val="18"/>
+        </w:rPr>
+        <w:t>Deschiderea fișierului fieldbox_bt_v0_3.ino</w:t>
+      </w:r>
+    </w:p>
+    <w:p>
+      <w:pPr>
+        <w:keepNext/>
+        <w:spacing w:after="60"/>
+        <w:ind w:left="510" w:hanging="340"/>
+      </w:pPr>
+      <w:r>
+        <w:rPr>
+          <w:b w:val="0"/>
+        </w:rPr>
+        <w:t xml:space="preserve">7. </w:t>
+      </w:r>
+      <w:r>
+        <w:rPr>
+          <w:b/>
+        </w:rPr>
+        <w:t>Tools → Board → esp32 → ESP32 Dev Module</w:t>
+      </w:r>
+      <w:r>
+        <w:t>.</w:t>
+      </w:r>
+    </w:p>
+    <w:p>
+      <w:pPr>
+        <w:keepNext/>
+        <w:jc w:val="center"/>
+      </w:pPr>
+      <w:r>
+        <w:drawing>
+          <wp:inline xmlns:a="http://schemas.openxmlformats.org/drawingml/2006/main" xmlns:pic="http://schemas.openxmlformats.org/drawingml/2006/picture">
+            <wp:extent cx="6120000" cy="2578050"/>
+            <wp:docPr id="16" name="Picture 16"/>
+            <wp:cNvGraphicFramePr>
+              <a:graphicFrameLocks noChangeAspect="1"/>
+            </wp:cNvGraphicFramePr>
+            <a:graphic>
+              <a:graphicData uri="http://schemas.openxmlformats.org/drawingml/2006/picture">
+                <pic:pic>
+                  <pic:nvPicPr>
+                    <pic:cNvPr id="0" name="fw_12.png"/>
+                    <pic:cNvPicPr/>
+                  </pic:nvPicPr>
+                  <pic:blipFill>
+                    <a:blip r:embed="rId24"/>
+                    <a:stretch>
+                      <a:fillRect/>
+                    </a:stretch>
+                  </pic:blipFill>
+                  <pic:spPr>
+                    <a:xfrm>
+                      <a:off x="0" y="0"/>
+                      <a:ext cx="6120000" cy="2578050"/>
+                    </a:xfrm>
+                    <a:prstGeom prst="rect"/>
+                  </pic:spPr>
+                </pic:pic>
+              </a:graphicData>
+            </a:graphic>
+          </wp:inline>
+        </w:drawing>
+      </w:r>
+    </w:p>
+    <w:p>
+      <w:pPr>
+        <w:jc w:val="center"/>
+      </w:pPr>
+      <w:r>
+        <w:rPr>
+          <w:i/>
+          <w:sz w:val="18"/>
+        </w:rPr>
+        <w:t>Tools → Board → esp32 → ESP32 Dev Module</w:t>
+      </w:r>
+    </w:p>
+    <w:p>
+      <w:pPr>
+        <w:keepNext/>
+        <w:spacing w:after="60"/>
+        <w:ind w:left="510" w:hanging="340"/>
+      </w:pPr>
+      <w:r>
+        <w:rPr>
+          <w:b w:val="0"/>
+        </w:rPr>
+        <w:t xml:space="preserve">8. </w:t>
+      </w:r>
+      <w:r>
+        <w:rPr>
+          <w:b/>
+        </w:rPr>
+        <w:t>Tools → Port</w:t>
+      </w:r>
+      <w:r>
+        <w:t xml:space="preserve"> → portul plăcii (de exemplu </w:t>
+      </w:r>
+      <w:r>
+        <w:rPr>
+          <w:b/>
+        </w:rPr>
+        <w:t>COM5</w:t>
+      </w:r>
+      <w:r>
+        <w:t>). Dacă apar mai multe porturi, scoateți cablul, uitați-vă care port dispare, apoi puneți-l la loc. Portul care reapare este al cutiei.</w:t>
+      </w:r>
+    </w:p>
+    <w:p>
+      <w:pPr>
+        <w:keepNext/>
+        <w:jc w:val="center"/>
+      </w:pPr>
+      <w:r>
+        <w:drawing>
+          <wp:inline xmlns:a="http://schemas.openxmlformats.org/drawingml/2006/main" xmlns:pic="http://schemas.openxmlformats.org/drawingml/2006/picture">
+            <wp:extent cx="5032000" cy="3060000"/>
+            <wp:docPr id="17" name="Picture 17"/>
+            <wp:cNvGraphicFramePr>
+              <a:graphicFrameLocks noChangeAspect="1"/>
+            </wp:cNvGraphicFramePr>
+            <a:graphic>
+              <a:graphicData uri="http://schemas.openxmlformats.org/drawingml/2006/picture">
+                <pic:pic>
+                  <pic:nvPicPr>
+                    <pic:cNvPr id="0" name="fw_13.png"/>
+                    <pic:cNvPicPr/>
+                  </pic:nvPicPr>
+                  <pic:blipFill>
+                    <a:blip r:embed="rId25"/>
+                    <a:stretch>
+                      <a:fillRect/>
+                    </a:stretch>
+                  </pic:blipFill>
+                  <pic:spPr>
+                    <a:xfrm>
+                      <a:off x="0" y="0"/>
+                      <a:ext cx="5032000" cy="3060000"/>
+                    </a:xfrm>
+                    <a:prstGeom prst="rect"/>
+                  </pic:spPr>
+                </pic:pic>
+              </a:graphicData>
+            </a:graphic>
+          </wp:inline>
+        </w:drawing>
+      </w:r>
+    </w:p>
+    <w:p>
+      <w:pPr>
+        <w:jc w:val="center"/>
+      </w:pPr>
+      <w:r>
+        <w:rPr>
+          <w:i/>
+          <w:sz w:val="18"/>
+        </w:rPr>
+        <w:t>Tools → Port</w:t>
+      </w:r>
+    </w:p>
+    <w:p>
+      <w:pPr>
+        <w:keepNext/>
+        <w:spacing w:after="60"/>
+        <w:ind w:left="510" w:hanging="340"/>
+      </w:pPr>
+      <w:r>
+        <w:rPr>
+          <w:b w:val="0"/>
+        </w:rPr>
+        <w:t xml:space="preserve">9. </w:t>
+      </w:r>
+      <w:r>
+        <w:rPr>
+          <w:b/>
+        </w:rPr>
+        <w:t>Tools → Partition Scheme → No OTA (2MB APP/2MB SPIFFS)</w:t>
+      </w:r>
+      <w:r>
+        <w:t>.</w:t>
+      </w:r>
+    </w:p>
+    <w:p>
+      <w:pPr>
+        <w:keepNext/>
+        <w:jc w:val="center"/>
+      </w:pPr>
+      <w:r>
+        <w:drawing>
+          <wp:inline xmlns:a="http://schemas.openxmlformats.org/drawingml/2006/main" xmlns:pic="http://schemas.openxmlformats.org/drawingml/2006/picture">
+            <wp:extent cx="6014742" cy="3060000"/>
+            <wp:docPr id="18" name="Picture 18"/>
+            <wp:cNvGraphicFramePr>
+              <a:graphicFrameLocks noChangeAspect="1"/>
+            </wp:cNvGraphicFramePr>
+            <a:graphic>
+              <a:graphicData uri="http://schemas.openxmlformats.org/drawingml/2006/picture">
+                <pic:pic>
+                  <pic:nvPicPr>
+                    <pic:cNvPr id="0" name="fw_14.png"/>
+                    <pic:cNvPicPr/>
+                  </pic:nvPicPr>
+                  <pic:blipFill>
+                    <a:blip r:embed="rId26"/>
+                    <a:stretch>
+                      <a:fillRect/>
+                    </a:stretch>
+                  </pic:blipFill>
+                  <pic:spPr>
+                    <a:xfrm>
+                      <a:off x="0" y="0"/>
+                      <a:ext cx="6014742" cy="3060000"/>
+                    </a:xfrm>
+                    <a:prstGeom prst="rect"/>
+                  </pic:spPr>
+                </pic:pic>
+              </a:graphicData>
+            </a:graphic>
+          </wp:inline>
+        </w:drawing>
+      </w:r>
+    </w:p>
+    <w:p>
+      <w:pPr>
+        <w:jc w:val="center"/>
+      </w:pPr>
+      <w:r>
+        <w:rPr>
+          <w:i/>
+          <w:sz w:val="18"/>
+        </w:rPr>
+        <w:t>Tools → Partition Scheme → No OTA (2MB APP/2MB SPIFFS)</w:t>
+      </w:r>
+    </w:p>
+    <w:p>
+      <w:pPr>
+        <w:keepNext/>
+        <w:spacing w:after="60"/>
+        <w:ind w:left="510" w:hanging="340"/>
+      </w:pPr>
+      <w:r>
+        <w:rPr>
+          <w:b w:val="0"/>
+        </w:rPr>
+        <w:t xml:space="preserve">10. </w:t>
+      </w:r>
+      <w:r>
+        <w:t xml:space="preserve">Deschideți încă o dată meniul </w:t>
+      </w:r>
+      <w:r>
+        <w:rPr>
+          <w:b/>
+        </w:rPr>
+        <w:t>Tools</w:t>
+      </w:r>
+      <w:r>
+        <w:t xml:space="preserve"> și verificați cele trei rânduri: </w:t>
+      </w:r>
+      <w:r>
+        <w:rPr>
+          <w:b/>
+        </w:rPr>
+        <w:t>Board: „ESP32 Dev Module”</w:t>
+      </w:r>
+      <w:r>
+        <w:t xml:space="preserve">, </w:t>
+      </w:r>
+      <w:r>
+        <w:rPr>
+          <w:b/>
+        </w:rPr>
+        <w:t>Port: „COM…”</w:t>
+      </w:r>
+      <w:r>
+        <w:t xml:space="preserve"> și </w:t>
+      </w:r>
+      <w:r>
+        <w:rPr>
+          <w:b/>
+        </w:rPr>
+        <w:t>Partition Scheme: „No OTA (2MB APP/2MB SPIFFS)”</w:t>
+      </w:r>
+      <w:r>
+        <w:t>.</w:t>
+      </w:r>
+    </w:p>
+    <w:p>
+      <w:pPr>
+        <w:keepNext/>
+        <w:jc w:val="center"/>
+      </w:pPr>
+      <w:r>
+        <w:drawing>
+          <wp:inline xmlns:a="http://schemas.openxmlformats.org/drawingml/2006/main" xmlns:pic="http://schemas.openxmlformats.org/drawingml/2006/picture">
+            <wp:extent cx="3546818" cy="3060000"/>
+            <wp:docPr id="19" name="Picture 19"/>
+            <wp:cNvGraphicFramePr>
+              <a:graphicFrameLocks noChangeAspect="1"/>
+            </wp:cNvGraphicFramePr>
+            <a:graphic>
+              <a:graphicData uri="http://schemas.openxmlformats.org/drawingml/2006/picture">
+                <pic:pic>
+                  <pic:nvPicPr>
+                    <pic:cNvPr id="0" name="fw_15.png"/>
+                    <pic:cNvPicPr/>
+                  </pic:nvPicPr>
+                  <pic:blipFill>
+                    <a:blip r:embed="rId27"/>
+                    <a:stretch>
+                      <a:fillRect/>
+                    </a:stretch>
+                  </pic:blipFill>
+                  <pic:spPr>
+                    <a:xfrm>
+                      <a:off x="0" y="0"/>
+                      <a:ext cx="3546818" cy="3060000"/>
+                    </a:xfrm>
+                    <a:prstGeom prst="rect"/>
+                  </pic:spPr>
+                </pic:pic>
+              </a:graphicData>
+            </a:graphic>
+          </wp:inline>
+        </w:drawing>
+      </w:r>
+    </w:p>
+    <w:p>
+      <w:pPr>
+        <w:jc w:val="center"/>
+      </w:pPr>
+      <w:r>
+        <w:rPr>
+          <w:i/>
+          <w:sz w:val="18"/>
+        </w:rPr>
+        <w:t>Verificarea setărilor din Tools</w:t>
+      </w:r>
+    </w:p>
+    <w:p>
+      <w:pPr>
+        <w:keepNext/>
+        <w:spacing w:after="60"/>
+        <w:ind w:left="510" w:hanging="340"/>
+      </w:pPr>
+      <w:r>
+        <w:rPr>
+          <w:b w:val="0"/>
+        </w:rPr>
+        <w:t xml:space="preserve">11. </w:t>
+      </w:r>
+      <w:r>
+        <w:t>Apăsați butonul rotund cu săgeata spre dreapta (</w:t>
+      </w:r>
+      <w:r>
+        <w:rPr>
+          <w:b/>
+        </w:rPr>
+        <w:t>Upload</w:t>
+      </w:r>
+      <w:r>
+        <w:t>).</w:t>
+      </w:r>
+    </w:p>
+    <w:p>
+      <w:pPr>
+        <w:keepNext/>
+        <w:jc w:val="center"/>
+      </w:pPr>
+      <w:r>
+        <w:drawing>
+          <wp:inline xmlns:a="http://schemas.openxmlformats.org/drawingml/2006/main" xmlns:pic="http://schemas.openxmlformats.org/drawingml/2006/picture">
+            <wp:extent cx="6120000" cy="2550000"/>
+            <wp:docPr id="20" name="Picture 20"/>
+            <wp:cNvGraphicFramePr>
+              <a:graphicFrameLocks noChangeAspect="1"/>
+            </wp:cNvGraphicFramePr>
+            <a:graphic>
+              <a:graphicData uri="http://schemas.openxmlformats.org/drawingml/2006/picture">
+                <pic:pic>
+                  <pic:nvPicPr>
+                    <pic:cNvPr id="0" name="fw_16.png"/>
+                    <pic:cNvPicPr/>
+                  </pic:nvPicPr>
+                  <pic:blipFill>
+                    <a:blip r:embed="rId28"/>
+                    <a:stretch>
+                      <a:fillRect/>
+                    </a:stretch>
+                  </pic:blipFill>
+                  <pic:spPr>
+                    <a:xfrm>
+                      <a:off x="0" y="0"/>
+                      <a:ext cx="6120000" cy="2550000"/>
+                    </a:xfrm>
+                    <a:prstGeom prst="rect"/>
+                  </pic:spPr>
+                </pic:pic>
+              </a:graphicData>
+            </a:graphic>
+          </wp:inline>
+        </w:drawing>
+      </w:r>
+    </w:p>
+    <w:p>
+      <w:pPr>
+        <w:jc w:val="center"/>
+      </w:pPr>
+      <w:r>
+        <w:rPr>
+          <w:i/>
+          <w:sz w:val="18"/>
+        </w:rPr>
+        <w:t>Butonul Upload</w:t>
+      </w:r>
+    </w:p>
+    <w:p>
+      <w:pPr>
+        <w:keepNext/>
+        <w:spacing w:after="60"/>
+        <w:ind w:left="510" w:hanging="340"/>
+      </w:pPr>
+      <w:r>
+        <w:rPr>
+          <w:b w:val="0"/>
+        </w:rPr>
+        <w:t xml:space="preserve">12. </w:t>
+      </w:r>
+      <w:r>
+        <w:t xml:space="preserve">Așteptați. Întâi apare </w:t>
+      </w:r>
+      <w:r>
+        <w:rPr>
+          <w:b/>
+        </w:rPr>
+        <w:t>Compiling sketch…</w:t>
+      </w:r>
+      <w:r>
+        <w:t xml:space="preserve"> (prima dată durează câteva minute), apoi </w:t>
+      </w:r>
+      <w:r>
+        <w:rPr>
+          <w:b/>
+        </w:rPr>
+        <w:t>Uploading…</w:t>
+      </w:r>
+      <w:r>
+        <w:t xml:space="preserve">, cu rânduri </w:t>
+      </w:r>
+      <w:r>
+        <w:rPr>
+          <w:b/>
+        </w:rPr>
+        <w:t>Writing at …</w:t>
+      </w:r>
+      <w:r>
+        <w:t xml:space="preserve"> care urcă până la 100 %.</w:t>
+      </w:r>
+    </w:p>
+    <w:p>
+      <w:pPr>
+        <w:keepNext/>
+        <w:jc w:val="center"/>
+      </w:pPr>
+      <w:r>
+        <w:drawing>
+          <wp:inline xmlns:a="http://schemas.openxmlformats.org/drawingml/2006/main" xmlns:pic="http://schemas.openxmlformats.org/drawingml/2006/picture">
+            <wp:extent cx="6120000" cy="1231650"/>
+            <wp:docPr id="21" name="Picture 21"/>
+            <wp:cNvGraphicFramePr>
+              <a:graphicFrameLocks noChangeAspect="1"/>
+            </wp:cNvGraphicFramePr>
+            <a:graphic>
+              <a:graphicData uri="http://schemas.openxmlformats.org/drawingml/2006/picture">
+                <pic:pic>
+                  <pic:nvPicPr>
+                    <pic:cNvPr id="0" name="fw_17.png"/>
+                    <pic:cNvPicPr/>
+                  </pic:nvPicPr>
+                  <pic:blipFill>
+                    <a:blip r:embed="rId29"/>
+                    <a:stretch>
+                      <a:fillRect/>
+                    </a:stretch>
+                  </pic:blipFill>
+                  <pic:spPr>
+                    <a:xfrm>
+                      <a:off x="0" y="0"/>
+                      <a:ext cx="6120000" cy="1231650"/>
+                    </a:xfrm>
+                    <a:prstGeom prst="rect"/>
+                  </pic:spPr>
+                </pic:pic>
+              </a:graphicData>
+            </a:graphic>
+          </wp:inline>
+        </w:drawing>
+      </w:r>
+    </w:p>
+    <w:p>
+      <w:pPr>
+        <w:jc w:val="center"/>
+      </w:pPr>
+      <w:r>
+        <w:rPr>
+          <w:i/>
+          <w:sz w:val="18"/>
+        </w:rPr>
+        <w:t>Compilare terminată, scrierea a început</w:t>
+      </w:r>
+    </w:p>
+    <w:p>
+      <w:pPr>
+        <w:keepNext/>
+        <w:spacing w:after="60"/>
+        <w:ind w:left="510" w:hanging="340"/>
+      </w:pPr>
+      <w:r>
+        <w:rPr>
+          <w:b w:val="0"/>
+        </w:rPr>
+        <w:t xml:space="preserve">13. </w:t>
+      </w:r>
+      <w:r>
+        <w:t xml:space="preserve">Scrierea s-a terminat când în fereastra de jos apar </w:t>
+      </w:r>
+      <w:r>
+        <w:rPr>
+          <w:b/>
+        </w:rPr>
+        <w:t>Hash of data verified</w:t>
+      </w:r>
+      <w:r>
+        <w:t xml:space="preserve"> și </w:t>
+      </w:r>
+      <w:r>
+        <w:rPr>
+          <w:b/>
+        </w:rPr>
+        <w:t>Hard resetting via RTS pin…</w:t>
+      </w:r>
+      <w:r>
+        <w:t>. Scoateți cablul USB.</w:t>
+      </w:r>
+    </w:p>
+    <w:p>
+      <w:pPr>
+        <w:keepNext/>
+        <w:jc w:val="center"/>
+      </w:pPr>
+      <w:r>
+        <w:drawing>
+          <wp:inline xmlns:a="http://schemas.openxmlformats.org/drawingml/2006/main" xmlns:pic="http://schemas.openxmlformats.org/drawingml/2006/picture">
+            <wp:extent cx="6120000" cy="1231650"/>
+            <wp:docPr id="22" name="Picture 22"/>
+            <wp:cNvGraphicFramePr>
+              <a:graphicFrameLocks noChangeAspect="1"/>
+            </wp:cNvGraphicFramePr>
+            <a:graphic>
+              <a:graphicData uri="http://schemas.openxmlformats.org/drawingml/2006/picture">
+                <pic:pic>
+                  <pic:nvPicPr>
+                    <pic:cNvPr id="0" name="fw_18.png"/>
+                    <pic:cNvPicPr/>
+                  </pic:nvPicPr>
+                  <pic:blipFill>
+                    <a:blip r:embed="rId30"/>
+                    <a:stretch>
+                      <a:fillRect/>
+                    </a:stretch>
+                  </pic:blipFill>
+                  <pic:spPr>
+                    <a:xfrm>
+                      <a:off x="0" y="0"/>
+                      <a:ext cx="6120000" cy="1231650"/>
+                    </a:xfrm>
+                    <a:prstGeom prst="rect"/>
+                  </pic:spPr>
+                </pic:pic>
+              </a:graphicData>
+            </a:graphic>
+          </wp:inline>
+        </w:drawing>
+      </w:r>
+    </w:p>
+    <w:p>
+      <w:pPr>
+        <w:jc w:val="center"/>
+      </w:pPr>
+      <w:r>
+        <w:rPr>
+          <w:i/>
+          <w:sz w:val="18"/>
+        </w:rPr>
+        <w:t>Scriere reușită</w:t>
+      </w:r>
+    </w:p>
+    <w:p>
+      <w:r>
+        <w:t xml:space="preserve">La prima pornire după scriere, cutia își reformatează stocarea (câteva secunde), apoi LED-ul stă aprins 2 secunde dacă senzorii sunt în regulă. În aplicație, tab-ul </w:t>
+      </w:r>
+      <w:r>
+        <w:rPr>
+          <w:b/>
+        </w:rPr>
+        <w:t>Boxes</w:t>
+      </w:r>
+      <w:r>
+        <w:t xml:space="preserve"> arată noua versiune (</w:t>
+      </w:r>
+      <w:r>
+        <w:rPr>
+          <w:rFonts w:ascii="Consolas" w:hAnsi="Consolas"/>
+          <w:sz w:val="19"/>
+        </w:rPr>
+        <w:t>firmware v0.3.1-bt</w:t>
+      </w:r>
+      <w:r>
+        <w:t>).</w:t>
+      </w:r>
+    </w:p>
+    <w:p>
+      <w:r>
+        <w:rPr>
+          <w:b/>
+        </w:rPr>
+        <w:t>Dacă nu merge:</w:t>
       </w:r>
     </w:p>
     <w:p>
@@ -1177,6 +2864,158 @@
         <w:pStyle w:val="ListBullet"/>
       </w:pPr>
       <w:r>
+        <w:rPr>
+          <w:b/>
+        </w:rPr>
+        <w:t>Nu apare niciun port la Tools → Port:</w:t>
+      </w:r>
+      <w:r>
+        <w:t xml:space="preserve"> cablul e doar de încărcare sau lipsește driverul CH340.</w:t>
+      </w:r>
+    </w:p>
+    <w:p>
+      <w:pPr>
+        <w:pStyle w:val="ListBullet"/>
+      </w:pPr>
+      <w:r>
+        <w:rPr>
+          <w:b/>
+        </w:rPr>
+        <w:t>„Failed to connect… Wrong boot mode”:</w:t>
+      </w:r>
+      <w:r>
+        <w:t xml:space="preserve"> țineți apăsat butonul </w:t>
+      </w:r>
+      <w:r>
+        <w:rPr>
+          <w:b/>
+        </w:rPr>
+        <w:t>BOOT</w:t>
+      </w:r>
+      <w:r>
+        <w:t xml:space="preserve"> de pe placă cât timp în fereastra de jos scrie </w:t>
+      </w:r>
+      <w:r>
+        <w:rPr>
+          <w:b/>
+        </w:rPr>
+        <w:t>Connecting…</w:t>
+      </w:r>
+      <w:r>
+        <w:t>, apoi eliberați-l.</w:t>
+      </w:r>
+    </w:p>
+    <w:p>
+      <w:pPr>
+        <w:pStyle w:val="ListBullet"/>
+      </w:pPr>
+      <w:r>
+        <w:rPr>
+          <w:b/>
+        </w:rPr>
+        <w:t>„Sketch too big”:</w:t>
+      </w:r>
+      <w:r>
+        <w:t xml:space="preserve"> nu ați ales </w:t>
+      </w:r>
+      <w:r>
+        <w:rPr>
+          <w:b/>
+        </w:rPr>
+        <w:t>No OTA (2MB APP/2MB SPIFFS)</w:t>
+      </w:r>
+      <w:r>
+        <w:t xml:space="preserve"> la pasul 9.</w:t>
+      </w:r>
+    </w:p>
+    <w:p>
+      <w:pPr>
+        <w:pStyle w:val="ListBullet"/>
+      </w:pPr>
+      <w:r>
+        <w:rPr>
+          <w:b/>
+        </w:rPr>
+        <w:t>„…h: No such file or directory”:</w:t>
+      </w:r>
+      <w:r>
+        <w:t xml:space="preserve"> lipsește una dintre bibliotecile de la pasul 5 din §5.2.</w:t>
+      </w:r>
+    </w:p>
+    <w:p>
+      <w:r>
+        <w:rPr>
+          <w:b/>
+        </w:rPr>
+        <w:t>Alte informații:</w:t>
+      </w:r>
+    </w:p>
+    <w:p>
+      <w:pPr>
+        <w:pStyle w:val="ListBullet"/>
+      </w:pPr>
+      <w:r>
+        <w:t>Numele cutiei (</w:t>
+      </w:r>
+      <w:r>
+        <w:rPr>
+          <w:b/>
+        </w:rPr>
+        <w:t>`BOX_xxxx`</w:t>
+      </w:r>
+      <w:r>
+        <w:t>) vine din adresa MAC Bluetooth a plăcii și nu se schimbă la o actualizare de firmware.</w:t>
+      </w:r>
+    </w:p>
+    <w:p>
+      <w:pPr>
+        <w:pStyle w:val="ListBullet"/>
+      </w:pPr>
+      <w:r>
+        <w:t xml:space="preserve">În pachet există și fișierul gata compilat </w:t>
+      </w:r>
+      <w:r>
+        <w:rPr>
+          <w:b/>
+        </w:rPr>
+        <w:t>`firmware/fieldbox-fw-&lt;versiune&gt;.bin`</w:t>
+      </w:r>
+      <w:r>
+        <w:t xml:space="preserve">, pentru cine folosește </w:t>
+      </w:r>
+      <w:r>
+        <w:rPr>
+          <w:b/>
+        </w:rPr>
+        <w:t>esptool</w:t>
+      </w:r>
+      <w:r>
+        <w:t xml:space="preserve"> sau </w:t>
+      </w:r>
+      <w:r>
+        <w:rPr>
+          <w:b/>
+        </w:rPr>
+        <w:t>Flash Download Tool</w:t>
+      </w:r>
+      <w:r>
+        <w:t xml:space="preserve">. Se scrie la adresa </w:t>
+      </w:r>
+      <w:r>
+        <w:rPr>
+          <w:b/>
+        </w:rPr>
+        <w:t>`0x0`</w:t>
+      </w:r>
+      <w:r>
+        <w:t>.</w:t>
+      </w:r>
+    </w:p>
+    <w:p>
+      <w:pPr>
+        <w:pStyle w:val="ListBullet"/>
+      </w:pPr>
+      <w:r>
         <w:t xml:space="preserve">O cutie cu </w:t>
       </w:r>
       <w:r>
@@ -1192,6 +3031,7 @@
     <w:p>
       <w:pPr>
         <w:pStyle w:val="Heading2"/>
+        <w:keepNext/>
       </w:pPr>
       <w:r>
         <w:t>6. Dezinstalare / date</w:t>

</xml_diff>

<commit_message>
Installing and updating the box are for teachers and pupils: no technician in the guides or on the page
</commit_message>
<xml_diff>
--- a/manuale/Instalare_RO.docx
+++ b/manuale/Instalare_RO.docx
@@ -1060,12 +1060,12 @@
         <w:keepNext/>
       </w:pPr>
       <w:r>
-        <w:t>5. Actualizarea cutiei (firmware) — pentru tehnician</w:t>
+        <w:t>5. Actualizarea cutiei (firmware)</w:t>
       </w:r>
     </w:p>
     <w:p>
       <w:r>
-        <w:t xml:space="preserve">Acest pas nu se face de către profesori — este pentru persoana care are grijă de cutii. Programul de pe cutie (firmware-ul) se scrie de pe un calculator cu Windows, prin cablul USB, cu </w:t>
+        <w:t xml:space="preserve">Programul de pe cutie (firmware-ul) se scrie de pe un calculator cu Windows, prin cablul USB, cu </w:t>
       </w:r>
       <w:r>
         <w:rPr>

</xml_diff>